<commit_message>
Finalize Lab 5 diffusion agent records
</commit_message>
<xml_diff>
--- a/agents/innovation_diffusion_agent/records/Lab5_Innovation_Diffusion_Agent_Record.docx
+++ b/agents/innovation_diffusion_agent/records/Lab5_Innovation_Diffusion_Agent_Record.docx
@@ -174,7 +174,7 @@
           </w:tcPr>
           <w:p>
             <w:r>
-              <w:t>REQUIRES STUDENT COMPLETION</w:t>
+              <w:t>Not specified</w:t>
             </w:r>
           </w:p>
         </w:tc>
@@ -384,7 +384,7 @@
           </w:tcPr>
           <w:p>
             <w:r>
-              <w:t>See final Git commit after submission preparation</w:t>
+              <w:t>b57d736 (Lab 5 implementation commit)</w:t>
             </w:r>
           </w:p>
         </w:tc>
@@ -1614,7 +1614,10 @@
           </w:tcPr>
           <w:p>
             <w:r>
-              <w:t>REQUIRES STUDENT COMPLETION: provide your independent judgment after reviewing the evidence and test outputs.</w:t>
+              <w:t>Based on the available evidence, LLM Coding Assistants are spreading rapidly among individual developers, but their diffusion within organizations is more difficult to determine. I believe trialability is one of the strongest factors encouraging diffusion because organizations can experiment with these tools before making larger commitments. However, uncertainty about productivity, code quality, security, and integration with existing workflows may slow broader organizational adoption.</w:t>
+              <w:br/>
+              <w:br/>
+              <w:t>For a mature SaaS company, I would recommend considering a small, controlled pilot with clear performance and quality measures rather than moving directly toward large-scale adoption. The timing should depend on the organization's readiness and risk tolerance. This assessment provides guidance on adoption timing without making the final adoption decision.</w:t>
             </w:r>
           </w:p>
         </w:tc>
@@ -1698,7 +1701,63 @@
           </w:tcPr>
           <w:p>
             <w:r>
-              <w:t>Codex created the scaffolded agent, built/executed both prompt packets, validated output structure, and checked frozen core. Public source pages were consulted. Student must verify source fit and provide independent judgment/reflection.</w:t>
+              <w:t>Codex created the scaffolded agent, built/executed both prompt packets, validated output structure, and checked frozen core. Public source pages were consulted. Student supplied the independent judgment and reflection recorded here.</w:t>
+            </w:r>
+          </w:p>
+        </w:tc>
+      </w:tr>
+      <w:tr>
+        <w:tc>
+          <w:tcPr>
+            <w:tcW w:type="dxa" w:w="5227"/>
+          </w:tcPr>
+          <w:p>
+            <w:r>
+              <w:t>Personal reflection</w:t>
+            </w:r>
+          </w:p>
+        </w:tc>
+        <w:tc>
+          <w:tcPr>
+            <w:tcW w:type="dxa" w:w="5227"/>
+          </w:tcPr>
+          <w:p>
+            <w:r>
+              <w:t>Through this lab, I gained a better understanding of the challenges and processes involved in moving a technology from innovation to widespread adoption. I realized that developing an innovative technology is only the beginning, and that successful diffusion depends on much more than the technology itself.</w:t>
+              <w:br/>
+              <w:br/>
+              <w:t>I think technological maturity is important, but so are real-world testing and validation. Organizations need evidence that a technology actually works, while also considering safety, ethical concerns, and regulatory requirements. Another important factor is how easily the technology can be adopted and integrated into existing systems and workflows.</w:t>
+              <w:br/>
+              <w:br/>
+              <w:t>This lab helped me understand why some promising technologies spread quickly while others face barriers, even when they offer significant potential benefits. It also showed me that widespread adoption is a gradual process that requires not only technological progress but also evidence, trust, and organizational readiness.</w:t>
+            </w:r>
+          </w:p>
+        </w:tc>
+      </w:tr>
+      <w:tr>
+        <w:tc>
+          <w:tcPr>
+            <w:tcW w:type="dxa" w:w="5227"/>
+          </w:tcPr>
+          <w:p>
+            <w:r>
+              <w:t>Personal reflection</w:t>
+            </w:r>
+          </w:p>
+        </w:tc>
+        <w:tc>
+          <w:tcPr>
+            <w:tcW w:type="dxa" w:w="5227"/>
+          </w:tcPr>
+          <w:p>
+            <w:r>
+              <w:t>Through this lab, I gained a better understanding of the challenges and processes involved in moving a technology from innovation to widespread adoption. I realized that developing an innovative technology is only the beginning, and that successful diffusion depends on much more than the technology itself.</w:t>
+              <w:br/>
+              <w:br/>
+              <w:t>I think technological maturity is important, but so are real-world testing and validation. Organizations need evidence that a technology actually works, while also considering safety, ethical concerns, and regulatory requirements. Another important factor is how easily the technology can be adopted and integrated into existing systems and workflows.</w:t>
+              <w:br/>
+              <w:br/>
+              <w:t>This lab helped me understand why some promising technologies spread quickly while others face barriers, even when they offer significant potential benefits. It also showed me that widespread adoption is a gradual process that requires not only technological progress but also evidence, trust, and organizational readiness.</w:t>
             </w:r>
           </w:p>
         </w:tc>

</xml_diff>